<commit_message>
chore: use only packaged fonts in the demo sample
The demo sample named Georgia, Verdana, and Aptos, which the demo does
not ship. The font list now shows Cambria and Century Gothic, and the
charts use Calibri, so the editor and PDF export report no substituted
fonts for the demo.

Co-Authored-By: Claude Opus 5.5 <noreply@anthropic.com>
</commit_message>
<xml_diff>
--- a/examples/vite/public/sample.docx
+++ b/examples/vite/public/sample.docx
@@ -1900,18 +1900,18 @@
       </w:r>
       <w:r>
         <w:rPr>
-          <w:rFonts w:ascii="Georgia" w:cs="Georgia" w:eastAsia="Georgia" w:hAnsi="Georgia"/>
+          <w:rFonts w:ascii="Cambria" w:cs="Cambria" w:eastAsia="Cambria" w:hAnsi="Cambria"/>
         </w:rPr>
-        <w:t xml:space="preserve">Georgia</w:t>
+        <w:t xml:space="preserve">Cambria</w:t>
       </w:r>
       <w:r>
         <w:t xml:space="preserve"> | </w:t>
       </w:r>
       <w:r>
         <w:rPr>
-          <w:rFonts w:ascii="Verdana" w:cs="Verdana" w:eastAsia="Verdana" w:hAnsi="Verdana"/>
+          <w:rFonts w:ascii="Century Gothic" w:cs="Century Gothic" w:eastAsia="Century Gothic" w:hAnsi="Century Gothic"/>
         </w:rPr>
-        <w:t xml:space="preserve">Verdana</w:t>
+        <w:t xml:space="preserve">Century Gothic</w:t>
       </w:r>
     </w:p>
     <w:p>
@@ -17176,7 +17176,7 @@
                 <a:solidFill>
                   <a:srgbClr val="25364A"/>
                 </a:solidFill>
-                <a:latin typeface="Aptos"/>
+                <a:latin typeface="Calibri"/>
               </a:defRPr>
             </a:pPr>
             <a:r>
@@ -17184,7 +17184,7 @@
                 <a:solidFill>
                   <a:srgbClr val="25364A"/>
                 </a:solidFill>
-                <a:latin typeface="Aptos"/>
+                <a:latin typeface="Calibri"/>
               </a:rPr>
               <a:t>Delivery and capacity</a:t>
             </a:r>
@@ -17530,7 +17530,7 @@
         <a:p>
           <a:pPr>
             <a:defRPr sz="1000" baseline="0">
-              <a:latin typeface="Aptos"/>
+              <a:latin typeface="Calibri"/>
             </a:defRPr>
           </a:pPr>
           <a:endParaRPr lang="en-US"/>
@@ -17573,7 +17573,7 @@
                 <a:solidFill>
                   <a:srgbClr val="25364A"/>
                 </a:solidFill>
-                <a:latin typeface="Aptos"/>
+                <a:latin typeface="Calibri"/>
               </a:defRPr>
             </a:pPr>
             <a:r>
@@ -17581,7 +17581,7 @@
                 <a:solidFill>
                   <a:srgbClr val="25364A"/>
                 </a:solidFill>
-                <a:latin typeface="Aptos"/>
+                <a:latin typeface="Calibri"/>
               </a:rPr>
               <a:t>Where effort goes</a:t>
             </a:r>
@@ -17724,7 +17724,7 @@
         <a:p>
           <a:pPr rtl="0">
             <a:defRPr sz="1000" baseline="0">
-              <a:latin typeface="Aptos"/>
+              <a:latin typeface="Calibri"/>
             </a:defRPr>
           </a:pPr>
           <a:endParaRPr lang="en-US"/>

</xml_diff>

<commit_message>
fix: tighten the font picker read and late font announcements
The font picker counts letters only, so ASCII digits in Korean or
Chinese dates no longer blank it, and it orders the selection once
instead of per span. Table cell selections use the same rule. East
Asian name detection reuses the shared code point blocks and no longer
counts HK or TC words, which Latin names use. Every late font install
exit announces the change, so a refused install does not leave
resolving stuck. The demo sample shows Calibri instead of Georgia and
drops Verdana, so it loads no fonts beyond the ones it already needs.

Co-Authored-By: Claude Opus 5.5 <noreply@anthropic.com>
</commit_message>
<xml_diff>
--- a/examples/vite/public/sample.docx
+++ b/examples/vite/public/sample.docx
@@ -1900,18 +1900,9 @@
       </w:r>
       <w:r>
         <w:rPr>
-          <w:rFonts w:ascii="Cambria" w:cs="Cambria" w:eastAsia="Cambria" w:hAnsi="Cambria"/>
+          <w:rFonts w:ascii="Calibri" w:cs="Calibri" w:eastAsia="Calibri" w:hAnsi="Calibri"/>
         </w:rPr>
-        <w:t xml:space="preserve">Cambria</w:t>
-      </w:r>
-      <w:r>
-        <w:t xml:space="preserve"> | </w:t>
-      </w:r>
-      <w:r>
-        <w:rPr>
-          <w:rFonts w:ascii="Century Gothic" w:cs="Century Gothic" w:eastAsia="Century Gothic" w:hAnsi="Century Gothic"/>
-        </w:rPr>
-        <w:t xml:space="preserve">Century Gothic</w:t>
+        <w:t xml:space="preserve">Calibri</w:t>
       </w:r>
     </w:p>
     <w:p>

</xml_diff>